<commit_message>
fix resp code and data
</commit_message>
<xml_diff>
--- a/Output/plots/Spats/Spat_Physiology/Spat_Resp/Light/light Data Filtering and Noise Removal.docx
+++ b/Output/plots/Spats/Spat_Physiology/Spat_Resp/Light/light Data Filtering and Noise Removal.docx
@@ -4,151 +4,480 @@
   <w:body>
     <w:p>
       <w:r>
-        <w:t>Prior to analysis, the dataset was screened for data entry errors; duplicate entries were removed, and grouping variables were standardized (e.g., correcting typographical errors in light depth labels).</w:t>
-      </w:r>
-    </w:p>
-    <w:p>
-      <w:r>
-        <w:t>Consistent with previous assays, a two-step filtering process was applied:</w:t>
-      </w:r>
-    </w:p>
-    <w:p>
-      <w:pPr>
-        <w:numPr>
-          <w:ilvl w:val="0"/>
-          <w:numId w:val="1"/>
-        </w:numPr>
-      </w:pPr>
-      <w:r>
         <w:rPr>
           <w:b/>
           <w:bCs/>
         </w:rPr>
-        <w:t>Lower Threshold:</w:t>
-      </w:r>
-      <w:r>
-        <w:t xml:space="preserve"> A conservative limit of detection was set at </w:t>
-      </w:r>
+        <w:t>Statistical Analysis: Respiration Rate under Variable Light Conditions</w:t>
+      </w:r>
+    </w:p>
+    <w:p>
       <w:r>
         <w:rPr>
           <w:b/>
           <w:bCs/>
         </w:rPr>
-        <w:t>0.1 nmol O₂ mm</w:t>
+        <w:t>Methods</w:t>
+      </w:r>
+    </w:p>
+    <w:p>
+      <w:r>
+        <w:t>Respiration rates (</w:t>
+      </w:r>
+      <w:r>
+        <w:rPr>
+          <w:i/>
+          <w:iCs/>
+        </w:rPr>
+        <w:t>OxyRate</w:t>
+      </w:r>
+      <w:r>
+        <w:t>, nmol O₂ mm</w:t>
       </w:r>
       <w:r>
         <w:rPr>
           <w:rFonts w:ascii="Cambria Math" w:hAnsi="Cambria Math" w:cs="Cambria Math"/>
-          <w:b/>
-          <w:bCs/>
         </w:rPr>
         <w:t>⁻</w:t>
       </w:r>
       <w:r>
         <w:rPr>
           <w:rFonts w:ascii="Aptos" w:hAnsi="Aptos" w:cs="Aptos"/>
-          <w:b/>
-          <w:bCs/>
         </w:rPr>
         <w:t>²</w:t>
       </w:r>
+      <w:r>
+        <w:t xml:space="preserve"> min</w:t>
+      </w:r>
+      <w:r>
+        <w:rPr>
+          <w:rFonts w:ascii="Cambria Math" w:hAnsi="Cambria Math" w:cs="Cambria Math"/>
+        </w:rPr>
+        <w:t>⁻</w:t>
+      </w:r>
+      <w:r>
+        <w:rPr>
+          <w:rFonts w:ascii="Aptos" w:hAnsi="Aptos" w:cs="Aptos"/>
+        </w:rPr>
+        <w:t>¹</w:t>
+      </w:r>
+      <w:r>
+        <w:t xml:space="preserve">) were compared between three coral morphs (HF, NF, PF) across three light conditions (10m, 50m, Dark). Prior to analysis, outliers were identified and removed using the IQR method (1.5 </w:t>
+      </w:r>
+      <w:r>
+        <w:rPr>
+          <w:rFonts w:ascii="Aptos" w:hAnsi="Aptos" w:cs="Aptos"/>
+        </w:rPr>
+        <w:t>×</w:t>
+      </w:r>
+      <w:r>
+        <w:t xml:space="preserve"> IQR) within each group, and one specific technical outlier (&gt; 2.0 in 10m/NF) was manually excluded. A Two-Way ANOVA was performed to test the effects of Morph, Light, and their interaction. Since the interaction was not significant (p &gt; 0.05), a Tukey</w:t>
+      </w:r>
+      <w:r>
+        <w:rPr>
+          <w:rFonts w:ascii="Aptos" w:hAnsi="Aptos" w:cs="Aptos"/>
+        </w:rPr>
+        <w:t>’</w:t>
+      </w:r>
+      <w:r>
+        <w:t>s HSD post-hoc test was performed on the main effect of Morph (pooled across light levels).</w:t>
+      </w:r>
+    </w:p>
+    <w:p>
       <w:r>
         <w:rPr>
           <w:b/>
           <w:bCs/>
         </w:rPr>
-        <w:t xml:space="preserve"> min</w:t>
-      </w:r>
-      <w:r>
-        <w:rPr>
-          <w:rFonts w:ascii="Cambria Math" w:hAnsi="Cambria Math" w:cs="Cambria Math"/>
-          <w:b/>
-          <w:bCs/>
-        </w:rPr>
-        <w:t>⁻</w:t>
-      </w:r>
-      <w:r>
-        <w:rPr>
-          <w:rFonts w:ascii="Aptos" w:hAnsi="Aptos" w:cs="Aptos"/>
-          <w:b/>
-          <w:bCs/>
-        </w:rPr>
-        <w:t>¹</w:t>
-      </w:r>
-      <w:r>
-        <w:t>. Values below this threshold (n = 49) were indistinguishable from background noise and excluded.</w:t>
+        <w:t>Results</w:t>
       </w:r>
     </w:p>
     <w:p>
-      <w:pPr>
-        <w:numPr>
-          <w:ilvl w:val="0"/>
-          <w:numId w:val="1"/>
-        </w:numPr>
-      </w:pPr>
+      <w:r>
+        <w:t>A Two-Way ANOVA revealed a significant main effect of Morph (F(2,215) = 4.14, p = 0.017). The effect of Light was marginal (p = 0.053), and there was no significant interaction between Morph and Light (F(4,215) = 1.09, p = 0.36), indicating that the physiological differences between morphs remained consistent across light environments.</w:t>
+      </w:r>
+    </w:p>
+    <w:p>
       <w:r>
         <w:rPr>
           <w:b/>
           <w:bCs/>
         </w:rPr>
-        <w:t>Upper Threshold:</w:t>
-      </w:r>
-      <w:r>
-        <w:t xml:space="preserve"> The upper statistical fence ($Q3 + 1.5 \times IQR$) for this specific dataset was calculated at </w:t>
-      </w:r>
+        <w:t>Post-hoc Comparisons (Main Effect of Morph)</w:t>
+      </w:r>
+    </w:p>
+    <w:tbl>
+      <w:tblPr>
+        <w:tblW w:w="0" w:type="auto"/>
+        <w:tblCellSpacing w:w="15" w:type="dxa"/>
+        <w:tblCellMar>
+          <w:top w:w="15" w:type="dxa"/>
+          <w:left w:w="15" w:type="dxa"/>
+          <w:bottom w:w="15" w:type="dxa"/>
+          <w:right w:w="15" w:type="dxa"/>
+        </w:tblCellMar>
+        <w:tblLook w:val="04A0" w:firstRow="1" w:lastRow="0" w:firstColumn="1" w:lastColumn="0" w:noHBand="0" w:noVBand="1"/>
+      </w:tblPr>
+      <w:tblGrid>
+        <w:gridCol w:w="1449"/>
+        <w:gridCol w:w="1242"/>
+        <w:gridCol w:w="904"/>
+        <w:gridCol w:w="1624"/>
+      </w:tblGrid>
+      <w:tr>
+        <w:trPr>
+          <w:tblHeader/>
+          <w:tblCellSpacing w:w="15" w:type="dxa"/>
+        </w:trPr>
+        <w:tc>
+          <w:tcPr>
+            <w:tcW w:w="0" w:type="auto"/>
+            <w:tcBorders>
+              <w:top w:val="single" w:sz="6" w:space="0" w:color="auto"/>
+              <w:left w:val="single" w:sz="6" w:space="0" w:color="auto"/>
+              <w:bottom w:val="single" w:sz="6" w:space="0" w:color="auto"/>
+              <w:right w:val="single" w:sz="6" w:space="0" w:color="auto"/>
+            </w:tcBorders>
+            <w:vAlign w:val="center"/>
+            <w:hideMark/>
+          </w:tcPr>
+          <w:p>
+            <w:r>
+              <w:rPr>
+                <w:b/>
+                <w:bCs/>
+              </w:rPr>
+              <w:t>Comparison</w:t>
+            </w:r>
+          </w:p>
+        </w:tc>
+        <w:tc>
+          <w:tcPr>
+            <w:tcW w:w="0" w:type="auto"/>
+            <w:tcBorders>
+              <w:top w:val="single" w:sz="6" w:space="0" w:color="auto"/>
+              <w:left w:val="single" w:sz="6" w:space="0" w:color="auto"/>
+              <w:bottom w:val="single" w:sz="6" w:space="0" w:color="auto"/>
+              <w:right w:val="single" w:sz="6" w:space="0" w:color="auto"/>
+            </w:tcBorders>
+            <w:vAlign w:val="center"/>
+            <w:hideMark/>
+          </w:tcPr>
+          <w:p>
+            <w:r>
+              <w:rPr>
+                <w:b/>
+                <w:bCs/>
+              </w:rPr>
+              <w:t>Difference</w:t>
+            </w:r>
+          </w:p>
+        </w:tc>
+        <w:tc>
+          <w:tcPr>
+            <w:tcW w:w="0" w:type="auto"/>
+            <w:tcBorders>
+              <w:top w:val="single" w:sz="6" w:space="0" w:color="auto"/>
+              <w:left w:val="single" w:sz="6" w:space="0" w:color="auto"/>
+              <w:bottom w:val="single" w:sz="6" w:space="0" w:color="auto"/>
+              <w:right w:val="single" w:sz="6" w:space="0" w:color="auto"/>
+            </w:tcBorders>
+            <w:vAlign w:val="center"/>
+            <w:hideMark/>
+          </w:tcPr>
+          <w:p>
+            <w:r>
+              <w:rPr>
+                <w:b/>
+                <w:bCs/>
+              </w:rPr>
+              <w:t>P-value</w:t>
+            </w:r>
+          </w:p>
+        </w:tc>
+        <w:tc>
+          <w:tcPr>
+            <w:tcW w:w="0" w:type="auto"/>
+            <w:tcBorders>
+              <w:top w:val="single" w:sz="6" w:space="0" w:color="auto"/>
+              <w:left w:val="single" w:sz="6" w:space="0" w:color="auto"/>
+              <w:bottom w:val="single" w:sz="6" w:space="0" w:color="auto"/>
+              <w:right w:val="single" w:sz="6" w:space="0" w:color="auto"/>
+            </w:tcBorders>
+            <w:vAlign w:val="center"/>
+            <w:hideMark/>
+          </w:tcPr>
+          <w:p>
+            <w:r>
+              <w:rPr>
+                <w:b/>
+                <w:bCs/>
+              </w:rPr>
+              <w:t>Significance</w:t>
+            </w:r>
+          </w:p>
+        </w:tc>
+      </w:tr>
+      <w:tr>
+        <w:trPr>
+          <w:tblCellSpacing w:w="15" w:type="dxa"/>
+        </w:trPr>
+        <w:tc>
+          <w:tcPr>
+            <w:tcW w:w="0" w:type="auto"/>
+            <w:tcBorders>
+              <w:top w:val="single" w:sz="6" w:space="0" w:color="auto"/>
+              <w:left w:val="single" w:sz="6" w:space="0" w:color="auto"/>
+              <w:bottom w:val="single" w:sz="6" w:space="0" w:color="auto"/>
+              <w:right w:val="single" w:sz="6" w:space="0" w:color="auto"/>
+            </w:tcBorders>
+            <w:vAlign w:val="center"/>
+            <w:hideMark/>
+          </w:tcPr>
+          <w:p>
+            <w:r>
+              <w:rPr>
+                <w:b/>
+                <w:bCs/>
+              </w:rPr>
+              <w:t>HF vs. NF</w:t>
+            </w:r>
+          </w:p>
+        </w:tc>
+        <w:tc>
+          <w:tcPr>
+            <w:tcW w:w="0" w:type="auto"/>
+            <w:tcBorders>
+              <w:top w:val="single" w:sz="6" w:space="0" w:color="auto"/>
+              <w:left w:val="single" w:sz="6" w:space="0" w:color="auto"/>
+              <w:bottom w:val="single" w:sz="6" w:space="0" w:color="auto"/>
+              <w:right w:val="single" w:sz="6" w:space="0" w:color="auto"/>
+            </w:tcBorders>
+            <w:vAlign w:val="center"/>
+            <w:hideMark/>
+          </w:tcPr>
+          <w:p>
+            <w:r>
+              <w:t>-0.18</w:t>
+            </w:r>
+          </w:p>
+        </w:tc>
+        <w:tc>
+          <w:tcPr>
+            <w:tcW w:w="0" w:type="auto"/>
+            <w:tcBorders>
+              <w:top w:val="single" w:sz="6" w:space="0" w:color="auto"/>
+              <w:left w:val="single" w:sz="6" w:space="0" w:color="auto"/>
+              <w:bottom w:val="single" w:sz="6" w:space="0" w:color="auto"/>
+              <w:right w:val="single" w:sz="6" w:space="0" w:color="auto"/>
+            </w:tcBorders>
+            <w:vAlign w:val="center"/>
+            <w:hideMark/>
+          </w:tcPr>
+          <w:p>
+            <w:r>
+              <w:rPr>
+                <w:b/>
+                <w:bCs/>
+              </w:rPr>
+              <w:t>0.022</w:t>
+            </w:r>
+          </w:p>
+        </w:tc>
+        <w:tc>
+          <w:tcPr>
+            <w:tcW w:w="0" w:type="auto"/>
+            <w:tcBorders>
+              <w:top w:val="single" w:sz="6" w:space="0" w:color="auto"/>
+              <w:left w:val="single" w:sz="6" w:space="0" w:color="auto"/>
+              <w:bottom w:val="single" w:sz="6" w:space="0" w:color="auto"/>
+              <w:right w:val="single" w:sz="6" w:space="0" w:color="auto"/>
+            </w:tcBorders>
+            <w:vAlign w:val="center"/>
+            <w:hideMark/>
+          </w:tcPr>
+          <w:p>
+            <w:r>
+              <w:t>Significant</w:t>
+            </w:r>
+          </w:p>
+        </w:tc>
+      </w:tr>
+      <w:tr>
+        <w:trPr>
+          <w:tblCellSpacing w:w="15" w:type="dxa"/>
+        </w:trPr>
+        <w:tc>
+          <w:tcPr>
+            <w:tcW w:w="0" w:type="auto"/>
+            <w:tcBorders>
+              <w:top w:val="single" w:sz="6" w:space="0" w:color="auto"/>
+              <w:left w:val="single" w:sz="6" w:space="0" w:color="auto"/>
+              <w:bottom w:val="single" w:sz="6" w:space="0" w:color="auto"/>
+              <w:right w:val="single" w:sz="6" w:space="0" w:color="auto"/>
+            </w:tcBorders>
+            <w:vAlign w:val="center"/>
+            <w:hideMark/>
+          </w:tcPr>
+          <w:p>
+            <w:r>
+              <w:rPr>
+                <w:b/>
+                <w:bCs/>
+              </w:rPr>
+              <w:t>HF vs. PF</w:t>
+            </w:r>
+          </w:p>
+        </w:tc>
+        <w:tc>
+          <w:tcPr>
+            <w:tcW w:w="0" w:type="auto"/>
+            <w:tcBorders>
+              <w:top w:val="single" w:sz="6" w:space="0" w:color="auto"/>
+              <w:left w:val="single" w:sz="6" w:space="0" w:color="auto"/>
+              <w:bottom w:val="single" w:sz="6" w:space="0" w:color="auto"/>
+              <w:right w:val="single" w:sz="6" w:space="0" w:color="auto"/>
+            </w:tcBorders>
+            <w:vAlign w:val="center"/>
+            <w:hideMark/>
+          </w:tcPr>
+          <w:p>
+            <w:r>
+              <w:t>-0.15</w:t>
+            </w:r>
+          </w:p>
+        </w:tc>
+        <w:tc>
+          <w:tcPr>
+            <w:tcW w:w="0" w:type="auto"/>
+            <w:tcBorders>
+              <w:top w:val="single" w:sz="6" w:space="0" w:color="auto"/>
+              <w:left w:val="single" w:sz="6" w:space="0" w:color="auto"/>
+              <w:bottom w:val="single" w:sz="6" w:space="0" w:color="auto"/>
+              <w:right w:val="single" w:sz="6" w:space="0" w:color="auto"/>
+            </w:tcBorders>
+            <w:vAlign w:val="center"/>
+            <w:hideMark/>
+          </w:tcPr>
+          <w:p>
+            <w:r>
+              <w:t>0.125</w:t>
+            </w:r>
+          </w:p>
+        </w:tc>
+        <w:tc>
+          <w:tcPr>
+            <w:tcW w:w="0" w:type="auto"/>
+            <w:tcBorders>
+              <w:top w:val="single" w:sz="6" w:space="0" w:color="auto"/>
+              <w:left w:val="single" w:sz="6" w:space="0" w:color="auto"/>
+              <w:bottom w:val="single" w:sz="6" w:space="0" w:color="auto"/>
+              <w:right w:val="single" w:sz="6" w:space="0" w:color="auto"/>
+            </w:tcBorders>
+            <w:vAlign w:val="center"/>
+            <w:hideMark/>
+          </w:tcPr>
+          <w:p>
+            <w:r>
+              <w:t>Not Significant</w:t>
+            </w:r>
+          </w:p>
+        </w:tc>
+      </w:tr>
+      <w:tr>
+        <w:trPr>
+          <w:tblCellSpacing w:w="15" w:type="dxa"/>
+        </w:trPr>
+        <w:tc>
+          <w:tcPr>
+            <w:tcW w:w="0" w:type="auto"/>
+            <w:tcBorders>
+              <w:top w:val="single" w:sz="6" w:space="0" w:color="auto"/>
+              <w:left w:val="single" w:sz="6" w:space="0" w:color="auto"/>
+              <w:bottom w:val="single" w:sz="6" w:space="0" w:color="auto"/>
+              <w:right w:val="single" w:sz="6" w:space="0" w:color="auto"/>
+            </w:tcBorders>
+            <w:vAlign w:val="center"/>
+            <w:hideMark/>
+          </w:tcPr>
+          <w:p>
+            <w:r>
+              <w:rPr>
+                <w:b/>
+                <w:bCs/>
+              </w:rPr>
+              <w:t>NF vs. PF</w:t>
+            </w:r>
+          </w:p>
+        </w:tc>
+        <w:tc>
+          <w:tcPr>
+            <w:tcW w:w="0" w:type="auto"/>
+            <w:tcBorders>
+              <w:top w:val="single" w:sz="6" w:space="0" w:color="auto"/>
+              <w:left w:val="single" w:sz="6" w:space="0" w:color="auto"/>
+              <w:bottom w:val="single" w:sz="6" w:space="0" w:color="auto"/>
+              <w:right w:val="single" w:sz="6" w:space="0" w:color="auto"/>
+            </w:tcBorders>
+            <w:vAlign w:val="center"/>
+            <w:hideMark/>
+          </w:tcPr>
+          <w:p>
+            <w:r>
+              <w:t>+0.03</w:t>
+            </w:r>
+          </w:p>
+        </w:tc>
+        <w:tc>
+          <w:tcPr>
+            <w:tcW w:w="0" w:type="auto"/>
+            <w:tcBorders>
+              <w:top w:val="single" w:sz="6" w:space="0" w:color="auto"/>
+              <w:left w:val="single" w:sz="6" w:space="0" w:color="auto"/>
+              <w:bottom w:val="single" w:sz="6" w:space="0" w:color="auto"/>
+              <w:right w:val="single" w:sz="6" w:space="0" w:color="auto"/>
+            </w:tcBorders>
+            <w:vAlign w:val="center"/>
+            <w:hideMark/>
+          </w:tcPr>
+          <w:p>
+            <w:r>
+              <w:t>0.924</w:t>
+            </w:r>
+          </w:p>
+        </w:tc>
+        <w:tc>
+          <w:tcPr>
+            <w:tcW w:w="0" w:type="auto"/>
+            <w:tcBorders>
+              <w:top w:val="single" w:sz="6" w:space="0" w:color="auto"/>
+              <w:left w:val="single" w:sz="6" w:space="0" w:color="auto"/>
+              <w:bottom w:val="single" w:sz="6" w:space="0" w:color="auto"/>
+              <w:right w:val="single" w:sz="6" w:space="0" w:color="auto"/>
+            </w:tcBorders>
+            <w:vAlign w:val="center"/>
+            <w:hideMark/>
+          </w:tcPr>
+          <w:p>
+            <w:r>
+              <w:t>Not Significant</w:t>
+            </w:r>
+          </w:p>
+        </w:tc>
+      </w:tr>
+    </w:tbl>
+    <w:p>
       <w:r>
         <w:rPr>
           <w:b/>
           <w:bCs/>
         </w:rPr>
-        <w:t>2.0 nmol O₂ mm</w:t>
-      </w:r>
-      <w:r>
-        <w:rPr>
-          <w:rFonts w:ascii="Cambria Math" w:hAnsi="Cambria Math" w:cs="Cambria Math"/>
-          <w:b/>
-          <w:bCs/>
-        </w:rPr>
-        <w:t>⁻</w:t>
-      </w:r>
-      <w:r>
-        <w:rPr>
-          <w:rFonts w:ascii="Aptos" w:hAnsi="Aptos" w:cs="Aptos"/>
-          <w:b/>
-          <w:bCs/>
-        </w:rPr>
-        <w:t>²</w:t>
-      </w:r>
-      <w:r>
-        <w:rPr>
-          <w:b/>
-          <w:bCs/>
-        </w:rPr>
-        <w:t xml:space="preserve"> min</w:t>
-      </w:r>
-      <w:r>
-        <w:rPr>
-          <w:rFonts w:ascii="Cambria Math" w:hAnsi="Cambria Math" w:cs="Cambria Math"/>
-          <w:b/>
-          <w:bCs/>
-        </w:rPr>
-        <w:t>⁻</w:t>
-      </w:r>
-      <w:r>
-        <w:rPr>
-          <w:rFonts w:ascii="Aptos" w:hAnsi="Aptos" w:cs="Aptos"/>
-          <w:b/>
-          <w:bCs/>
-        </w:rPr>
-        <w:t>¹</w:t>
-      </w:r>
-      <w:r>
-        <w:t>. Five data points exceeded this limit, including multiple values from "Plate D," which had previously exhibited technical artifacts. To ensure data integrity, all values &gt; 2.0 were removed.</w:t>
+        <w:t>Conclusion</w:t>
       </w:r>
     </w:p>
     <w:p>
       <w:r>
-        <w:t>The final validated dataset (approx. n = 170) satisfied assumptions of normality and homogeneity of variance for comparative analysis.</w:t>
+        <w:t>Across all light conditions, the High Fluorescence (HF) morph maintained a significantly higher respiration rate compared to the Non-Fluorescent (NF) morph. While the HF morph also trended higher than the Positive Fluorescence (PF) morph, this difference was not statistically significant.</w:t>
       </w:r>
     </w:p>
     <w:p/>

</xml_diff>